<commit_message>
Security hardening: PIN brute-force lockout, salted-hash PIN at rest, tamper-event DP
- PIN stored as per-device salted 2048-round SHA-256 (sha256.*), never plaintext
- Brute-force lockout after 5 fails with growing back-off (persisted fail count)
- Tamper events (events.*) pushed to app: forced push-down + enclosure/RST opened
- New DPs 112 pin_locked, 113 tamper; verify_pin honours lockout and drops link
- SHA-256 verified vs standard vectors; lockout logic unit-tested; docs + Word doc updated
</commit_message>
<xml_diff>
--- a/firmware/docs/BLOC-Bollard-Firmware-Specification.docx
+++ b/firmware/docs/BLOC-Bollard-Firmware-Specification.docx
@@ -1888,6 +1888,150 @@
           </w:p>
         </w:tc>
       </w:tr>
+      <w:tr>
+        <w:tc>
+          <w:tcPr>
+            <w:tcW w:type="dxa" w:w="720"/>
+          </w:tcPr>
+          <w:p>
+            <w:r/>
+            <w:r>
+              <w:rPr>
+                <w:sz w:val="18"/>
+              </w:rPr>
+              <w:t>112</w:t>
+            </w:r>
+          </w:p>
+        </w:tc>
+        <w:tc>
+          <w:tcPr>
+            <w:tcW w:type="dxa" w:w="1872"/>
+          </w:tcPr>
+          <w:p>
+            <w:r/>
+            <w:r>
+              <w:rPr>
+                <w:sz w:val="18"/>
+              </w:rPr>
+              <w:t>pin_locked</w:t>
+            </w:r>
+          </w:p>
+        </w:tc>
+        <w:tc>
+          <w:tcPr>
+            <w:tcW w:type="dxa" w:w="1152"/>
+          </w:tcPr>
+          <w:p>
+            <w:r/>
+            <w:r>
+              <w:rPr>
+                <w:sz w:val="18"/>
+              </w:rPr>
+              <w:t>bool</w:t>
+            </w:r>
+          </w:p>
+        </w:tc>
+        <w:tc>
+          <w:tcPr>
+            <w:tcW w:type="dxa" w:w="864"/>
+          </w:tcPr>
+          <w:p>
+            <w:r/>
+            <w:r>
+              <w:rPr>
+                <w:sz w:val="18"/>
+              </w:rPr>
+              <w:t>r</w:t>
+            </w:r>
+          </w:p>
+        </w:tc>
+        <w:tc>
+          <w:tcPr>
+            <w:tcW w:type="dxa" w:w="4032"/>
+          </w:tcPr>
+          <w:p>
+            <w:r/>
+            <w:r>
+              <w:rPr>
+                <w:sz w:val="18"/>
+              </w:rPr>
+              <w:t>1 while PIN entry is locked out (brute-force defence)</w:t>
+            </w:r>
+          </w:p>
+        </w:tc>
+      </w:tr>
+      <w:tr>
+        <w:tc>
+          <w:tcPr>
+            <w:tcW w:type="dxa" w:w="720"/>
+          </w:tcPr>
+          <w:p>
+            <w:r/>
+            <w:r>
+              <w:rPr>
+                <w:sz w:val="18"/>
+              </w:rPr>
+              <w:t>113</w:t>
+            </w:r>
+          </w:p>
+        </w:tc>
+        <w:tc>
+          <w:tcPr>
+            <w:tcW w:type="dxa" w:w="1872"/>
+          </w:tcPr>
+          <w:p>
+            <w:r/>
+            <w:r>
+              <w:rPr>
+                <w:sz w:val="18"/>
+              </w:rPr>
+              <w:t>tamper</w:t>
+            </w:r>
+          </w:p>
+        </w:tc>
+        <w:tc>
+          <w:tcPr>
+            <w:tcW w:type="dxa" w:w="1152"/>
+          </w:tcPr>
+          <w:p>
+            <w:r/>
+            <w:r>
+              <w:rPr>
+                <w:sz w:val="18"/>
+              </w:rPr>
+              <w:t>enum</w:t>
+            </w:r>
+          </w:p>
+        </w:tc>
+        <w:tc>
+          <w:tcPr>
+            <w:tcW w:type="dxa" w:w="864"/>
+          </w:tcPr>
+          <w:p>
+            <w:r/>
+            <w:r>
+              <w:rPr>
+                <w:sz w:val="18"/>
+              </w:rPr>
+              <w:t>r</w:t>
+            </w:r>
+          </w:p>
+        </w:tc>
+        <w:tc>
+          <w:tcPr>
+            <w:tcW w:type="dxa" w:w="4032"/>
+          </w:tcPr>
+          <w:p>
+            <w:r/>
+            <w:r>
+              <w:rPr>
+                <w:sz w:val="18"/>
+              </w:rPr>
+              <w:t>1 forced push-down, 2 enclosure/RST opened</w:t>
+            </w:r>
+          </w:p>
+        </w:tc>
+      </w:tr>
     </w:tbl>
     <w:p>
       <w:pPr>
@@ -2047,6 +2191,40 @@
       </w:pPr>
       <w:r>
         <w:t>Installer Master override and PCB BLE-recovery provide safe recovery paths for lost remotes/PIN.</w:t>
+      </w:r>
+    </w:p>
+    <w:p>
+      <w:pPr>
+        <w:pStyle w:val="ListBullet"/>
+      </w:pPr>
+      <w:r>
+        <w:t>PIN brute-force lockout: after 5 wrong attempts, PIN entry is locked with an increasing back-off (30 s up to ~16 min); the fail count is persisted so a reboot cannot reset it. App is told via the pin_locked DP.</w:t>
+      </w:r>
+    </w:p>
+    <w:p>
+      <w:pPr>
+        <w:pStyle w:val="ListBullet"/>
+      </w:pPr>
+      <w:r>
+        <w:t>PIN stored hashed: the custom PIN is kept as a per-device salted, 2048-round SHA-256 hash — never in plaintext. For full protection against a physical flash dump, also enable the SoC flash read-out protection at production.</w:t>
+      </w:r>
+    </w:p>
+    <w:p>
+      <w:pPr>
+        <w:pStyle w:val="ListBullet"/>
+      </w:pPr>
+      <w:r>
+        <w:t>Tamper alerts: a tamper DP is pushed to the app when the anti-tamper re-drive fires (forced push-down) or the enclosure/RST button is pressed.</w:t>
+      </w:r>
+    </w:p>
+    <w:p>
+      <w:r>
+        <w:rPr>
+          <w:b w:val="0"/>
+          <w:i/>
+          <w:color w:val="555B61"/>
+        </w:rPr>
+        <w:t>Recommended factory step (not in firmware): enable the BT3L flash read-out / debug-port protection, and confirm the Tuya BLE secure (encrypted) session is enabled so the PIN cannot be sniffed over the air.</w:t>
       </w:r>
     </w:p>
     <w:p>

</xml_diff>

<commit_message>
Add encrypted-link PIN gate (#3) and KeeLoq secure-learning support (#4)
- #3: hal_ble_link_is_encrypted() + REQUIRE_ENCRYPTED_LINK; verify/change PIN
  refused and link dropped unless the Tuya BLE secure session is established
- #4: keeloq secure-learning key derivation + decode-with-key + per-fob key
  storage (remote_store device_key) + rf_remote_learn_secure() hook;
  KEELOQ_SECURE_LEARNING config switch (default Normal). Cipher re-verified.
- Note: #1 PIN brute-force lockout and #2 hashed PIN were already implemented.
- Docs + Word spec updated.
</commit_message>
<xml_diff>
--- a/firmware/docs/BLOC-Bollard-Firmware-Specification.docx
+++ b/firmware/docs/BLOC-Bollard-Firmware-Specification.docx
@@ -2218,13 +2218,29 @@
       </w:r>
     </w:p>
     <w:p>
+      <w:pPr>
+        <w:pStyle w:val="ListBullet"/>
+      </w:pPr>
+      <w:r>
+        <w:t>Encrypted link required for the PIN: the firmware refuses verify/change PIN (and drops the link) unless the Tuya BLE secure (encrypted) session is up, so the PIN cannot be sniffed over the air (hal_ble_link_is_encrypted + REQUIRE_ENCRYPTED_LINK; the factory wires it to the SDK secure-session state).</w:t>
+      </w:r>
+    </w:p>
+    <w:p>
+      <w:pPr>
+        <w:pStyle w:val="ListBullet"/>
+      </w:pPr>
+      <w:r>
+        <w:t>KeeLoq secure-learning option: KEELOQ_SECURE_LEARNING selects Normal (key from serial) or Secure (key from the fob’s transmitted seed, stored per-fob). The KeeLoq manufacturer key must be kept secret.</w:t>
+      </w:r>
+    </w:p>
+    <w:p>
       <w:r>
         <w:rPr>
           <w:b w:val="0"/>
           <w:i/>
           <w:color w:val="555B61"/>
         </w:rPr>
-        <w:t>Recommended factory step (not in firmware): enable the BT3L flash read-out / debug-port protection, and confirm the Tuya BLE secure (encrypted) session is enabled so the PIN cannot be sniffed over the air.</w:t>
+        <w:t>Recommended factory steps (hardware/SDK, not firmware): enable the BT3L flash read-out / debug-port protection; confirm the Tuya BLE secure session is enabled; keep the KeeLoq manufacturer key out of source control.</w:t>
       </w:r>
     </w:p>
     <w:p>

</xml_diff>

<commit_message>
Add YET integration guide (Section 10 in the Word spec + standalone markdown)
</commit_message>
<xml_diff>
--- a/firmware/docs/BLOC-Bollard-Firmware-Specification.docx
+++ b/firmware/docs/BLOC-Bollard-Firmware-Specification.docx
@@ -2323,6 +2323,748 @@
         <w:t>Five demonstration videos: remote control; app control; one remote+app→many bollards; many remotes+phones→one bollard; Bluetooth reset &amp; recovery.</w:t>
       </w:r>
     </w:p>
+    <w:p>
+      <w:r>
+        <w:br w:type="page"/>
+      </w:r>
+    </w:p>
+    <w:p>
+      <w:pPr>
+        <w:pStyle w:val="Heading1"/>
+      </w:pPr>
+      <w:r>
+        <w:t>10. Integration guide (for YET)</w:t>
+      </w:r>
+    </w:p>
+    <w:p>
+      <w:r>
+        <w:rPr>
+          <w:b w:val="0"/>
+          <w:i w:val="0"/>
+        </w:rPr>
+        <w:t>This guide is written for YET, who already build the YET8542BTR firmware on the Tuya BLE SDK and can modify the source. Our reference is plain C structured around the same Tuya BLE SDK model, so the work is to MERGE our feature modules into your existing project and wire up the SDK callbacks — not to rewrite anything.</w:t>
+      </w:r>
+    </w:p>
+    <w:p>
+      <w:pPr>
+        <w:pStyle w:val="Heading2"/>
+      </w:pPr>
+      <w:r>
+        <w:t>10.1 Overview of the task</w:t>
+      </w:r>
+    </w:p>
+    <w:p>
+      <w:pPr>
+        <w:pStyle w:val="ListBullet"/>
+      </w:pPr>
+      <w:r>
+        <w:t>Language/framework: identical — C on the Tuya BLE SDK (data points, tuya_ble_sdk_init, DP/connection callbacks).</w:t>
+      </w:r>
+    </w:p>
+    <w:p>
+      <w:pPr>
+        <w:pStyle w:val="ListBullet"/>
+      </w:pPr>
+      <w:r>
+        <w:t>You keep your existing Tuya provisioning, OTA, and the YET RF front-end. You add our application logic (actuator, security, battery, sleep, remote/PIN management) and the data points.</w:t>
+      </w:r>
+    </w:p>
+    <w:p>
+      <w:pPr>
+        <w:pStyle w:val="ListBullet"/>
+      </w:pPr>
+      <w:r>
+        <w:t>Estimated touch points: copy ~14 C/H modules, implement one HAL file for your pins/peripherals, create the DP list, and route 3 SDK callbacks.</w:t>
+      </w:r>
+    </w:p>
+    <w:p>
+      <w:pPr>
+        <w:pStyle w:val="Heading2"/>
+      </w:pPr>
+      <w:r>
+        <w:t>10.2 Step-by-step</w:t>
+      </w:r>
+    </w:p>
+    <w:p>
+      <w:pPr>
+        <w:pStyle w:val="ListNumber"/>
+      </w:pPr>
+      <w:r>
+        <w:t>Confirm the build: the Tuya BLE SoC SDK project for the YET8542BTR’s chip, your Product ID (PID), and the flash tool.</w:t>
+      </w:r>
+    </w:p>
+    <w:p>
+      <w:pPr>
+        <w:pStyle w:val="ListNumber"/>
+      </w:pPr>
+      <w:r>
+        <w:t>Add our modules to the project (see the file map below). They are platform-independent C.</w:t>
+      </w:r>
+    </w:p>
+    <w:p>
+      <w:pPr>
+        <w:pStyle w:val="ListNumber"/>
+      </w:pPr>
+      <w:r>
+        <w:t>Implement ONE file — board_hal.c — against the YET8542BTR hardware: GPIO, ADC (current shunt + battery), flash key/value, BLE helpers, RF frame capture, deep-sleep/wake, RNG, and the secure-session check. Every function is stubbed and marked “&gt;&gt;&gt; FACTORY &lt;&lt;&lt;”.</w:t>
+      </w:r>
+    </w:p>
+    <w:p>
+      <w:pPr>
+        <w:pStyle w:val="ListNumber"/>
+      </w:pPr>
+      <w:r>
+        <w:t>Fill app_config.h: the real GPIO/pin map and active levels; the KeeLoq manufacturer key and learning scheme (Normal or Secure); the obstruction/battery thresholds if your mechanics differ.</w:t>
+      </w:r>
+    </w:p>
+    <w:p>
+      <w:pPr>
+        <w:pStyle w:val="ListNumber"/>
+      </w:pPr>
+      <w:r>
+        <w:t>Create the data points (Section 4) on the Tuya product exactly as listed (IDs and types must match).</w:t>
+      </w:r>
+    </w:p>
+    <w:p>
+      <w:pPr>
+        <w:pStyle w:val="ListNumber"/>
+      </w:pPr>
+      <w:r>
+        <w:t>Route the Tuya SDK callbacks to our entry points (Section 10.3).</w:t>
+      </w:r>
+    </w:p>
+    <w:p>
+      <w:pPr>
+        <w:pStyle w:val="ListNumber"/>
+      </w:pPr>
+      <w:r>
+        <w:t>Build, flash, and run the feature test list (Section 10.4).</w:t>
+      </w:r>
+    </w:p>
+    <w:p>
+      <w:pPr>
+        <w:pStyle w:val="Heading2"/>
+      </w:pPr>
+      <w:r>
+        <w:t>10.3 Wire these three Tuya SDK callbacks</w:t>
+      </w:r>
+    </w:p>
+    <w:p>
+      <w:pPr>
+        <w:pStyle w:val="ListBullet"/>
+      </w:pPr>
+      <w:r>
+        <w:t>On a BLE connection established  -&gt;  app_on_ble_connected()</w:t>
+      </w:r>
+    </w:p>
+    <w:p>
+      <w:pPr>
+        <w:pStyle w:val="ListBullet"/>
+      </w:pPr>
+      <w:r>
+        <w:t>On a BLE disconnection           -&gt;  app_on_ble_disconnected()</w:t>
+      </w:r>
+    </w:p>
+    <w:p>
+      <w:pPr>
+        <w:pStyle w:val="ListBullet"/>
+      </w:pPr>
+      <w:r>
+        <w:t>On DP data received from the app -&gt;  app_on_dp_received(dp_buffer, dp_len)</w:t>
+      </w:r>
+    </w:p>
+    <w:p>
+      <w:r>
+        <w:rPr>
+          <w:b w:val="0"/>
+          <w:i w:val="0"/>
+          <w:color w:val="555B61"/>
+        </w:rPr>
+        <w:t>Also call app_init() once at startup and app_loop_once() from your main loop (or the SDK’s periodic hook). Keep BLE advertising OFF at boot — it is opened only by the pairing-window logic.</w:t>
+      </w:r>
+    </w:p>
+    <w:p>
+      <w:pPr>
+        <w:pStyle w:val="Heading2"/>
+      </w:pPr>
+      <w:r>
+        <w:t>10.4 What to implement in board_hal.c (the only HW file)</w:t>
+      </w:r>
+    </w:p>
+    <w:tbl>
+      <w:tblPr>
+        <w:tblStyle w:val="LightGrid-Accent1"/>
+        <w:tblW w:type="auto" w:w="0"/>
+        <w:jc w:val="left"/>
+        <w:tblLook w:firstColumn="1" w:firstRow="1" w:lastColumn="0" w:lastRow="0" w:noHBand="0" w:noVBand="1" w:val="04A0"/>
+      </w:tblPr>
+      <w:tblGrid>
+        <w:gridCol w:w="4320"/>
+        <w:gridCol w:w="4320"/>
+      </w:tblGrid>
+      <w:tr>
+        <w:tc>
+          <w:tcPr>
+            <w:tcW w:type="dxa" w:w="3888"/>
+          </w:tcPr>
+          <w:p>
+            <w:r/>
+            <w:r>
+              <w:rPr>
+                <w:b/>
+                <w:sz w:val="18"/>
+              </w:rPr>
+              <w:t>HAL function</w:t>
+            </w:r>
+          </w:p>
+        </w:tc>
+        <w:tc>
+          <w:tcPr>
+            <w:tcW w:type="dxa" w:w="4752"/>
+          </w:tcPr>
+          <w:p>
+            <w:r/>
+            <w:r>
+              <w:rPr>
+                <w:b/>
+                <w:sz w:val="18"/>
+              </w:rPr>
+              <w:t>Wire to</w:t>
+            </w:r>
+          </w:p>
+        </w:tc>
+      </w:tr>
+      <w:tr>
+        <w:tc>
+          <w:tcPr>
+            <w:tcW w:type="dxa" w:w="3888"/>
+          </w:tcPr>
+          <w:p>
+            <w:r/>
+            <w:r>
+              <w:rPr>
+                <w:sz w:val="18"/>
+              </w:rPr>
+              <w:t>hal_gpio_init / output / read</w:t>
+            </w:r>
+          </w:p>
+        </w:tc>
+        <w:tc>
+          <w:tcPr>
+            <w:tcW w:type="dxa" w:w="4752"/>
+          </w:tcPr>
+          <w:p>
+            <w:r/>
+            <w:r>
+              <w:rPr>
+                <w:sz w:val="18"/>
+              </w:rPr>
+              <w:t>Relays UP/DOWN, LED strip, RST button, limit switches</w:t>
+            </w:r>
+          </w:p>
+        </w:tc>
+      </w:tr>
+      <w:tr>
+        <w:tc>
+          <w:tcPr>
+            <w:tcW w:type="dxa" w:w="3888"/>
+          </w:tcPr>
+          <w:p>
+            <w:r/>
+            <w:r>
+              <w:rPr>
+                <w:sz w:val="18"/>
+              </w:rPr>
+              <w:t>hal_adc_read_mv / hal_motor_current_ma</w:t>
+            </w:r>
+          </w:p>
+        </w:tc>
+        <w:tc>
+          <w:tcPr>
+            <w:tcW w:type="dxa" w:w="4752"/>
+          </w:tcPr>
+          <w:p>
+            <w:r/>
+            <w:r>
+              <w:rPr>
+                <w:sz w:val="18"/>
+              </w:rPr>
+              <w:t>Battery divider and low-side current shunt</w:t>
+            </w:r>
+          </w:p>
+        </w:tc>
+      </w:tr>
+      <w:tr>
+        <w:tc>
+          <w:tcPr>
+            <w:tcW w:type="dxa" w:w="3888"/>
+          </w:tcPr>
+          <w:p>
+            <w:r/>
+            <w:r>
+              <w:rPr>
+                <w:sz w:val="18"/>
+              </w:rPr>
+              <w:t>hal_nv_read / hal_nv_write</w:t>
+            </w:r>
+          </w:p>
+        </w:tc>
+        <w:tc>
+          <w:tcPr>
+            <w:tcW w:type="dxa" w:w="4752"/>
+          </w:tcPr>
+          <w:p>
+            <w:r/>
+            <w:r>
+              <w:rPr>
+                <w:sz w:val="18"/>
+              </w:rPr>
+              <w:t>Tuya flash key/value (paired fobs, PIN hash, settings)</w:t>
+            </w:r>
+          </w:p>
+        </w:tc>
+      </w:tr>
+      <w:tr>
+        <w:tc>
+          <w:tcPr>
+            <w:tcW w:type="dxa" w:w="3888"/>
+          </w:tcPr>
+          <w:p>
+            <w:r/>
+            <w:r>
+              <w:rPr>
+                <w:sz w:val="18"/>
+              </w:rPr>
+              <w:t>hal_rf_init (callback)</w:t>
+            </w:r>
+          </w:p>
+        </w:tc>
+        <w:tc>
+          <w:tcPr>
+            <w:tcW w:type="dxa" w:w="4752"/>
+          </w:tcPr>
+          <w:p>
+            <w:r/>
+            <w:r>
+              <w:rPr>
+                <w:sz w:val="18"/>
+              </w:rPr>
+              <w:t>Your 433.92 MHz receiver — deliver each KeeLoq frame to the callback</w:t>
+            </w:r>
+          </w:p>
+        </w:tc>
+      </w:tr>
+      <w:tr>
+        <w:tc>
+          <w:tcPr>
+            <w:tcW w:type="dxa" w:w="3888"/>
+          </w:tcPr>
+          <w:p>
+            <w:r/>
+            <w:r>
+              <w:rPr>
+                <w:sz w:val="18"/>
+              </w:rPr>
+              <w:t>hal_ble_* + hal_ble_link_is_encrypted</w:t>
+            </w:r>
+          </w:p>
+        </w:tc>
+        <w:tc>
+          <w:tcPr>
+            <w:tcW w:type="dxa" w:w="4752"/>
+          </w:tcPr>
+          <w:p>
+            <w:r/>
+            <w:r>
+              <w:rPr>
+                <w:sz w:val="18"/>
+              </w:rPr>
+              <w:t>Tuya GAP adv/disconnect + the secure-session state</w:t>
+            </w:r>
+          </w:p>
+        </w:tc>
+      </w:tr>
+      <w:tr>
+        <w:tc>
+          <w:tcPr>
+            <w:tcW w:type="dxa" w:w="3888"/>
+          </w:tcPr>
+          <w:p>
+            <w:r/>
+            <w:r>
+              <w:rPr>
+                <w:sz w:val="18"/>
+              </w:rPr>
+              <w:t>hal_enter_deep_sleep / hal_configure_wake_sources</w:t>
+            </w:r>
+          </w:p>
+        </w:tc>
+        <w:tc>
+          <w:tcPr>
+            <w:tcW w:type="dxa" w:w="4752"/>
+          </w:tcPr>
+          <w:p>
+            <w:r/>
+            <w:r>
+              <w:rPr>
+                <w:sz w:val="18"/>
+              </w:rPr>
+              <w:t>Low-power mode + RF-INT / BLE / limit-up wake</w:t>
+            </w:r>
+          </w:p>
+        </w:tc>
+      </w:tr>
+      <w:tr>
+        <w:tc>
+          <w:tcPr>
+            <w:tcW w:type="dxa" w:w="3888"/>
+          </w:tcPr>
+          <w:p>
+            <w:r/>
+            <w:r>
+              <w:rPr>
+                <w:sz w:val="18"/>
+              </w:rPr>
+              <w:t>hal_rand_fill</w:t>
+            </w:r>
+          </w:p>
+        </w:tc>
+        <w:tc>
+          <w:tcPr>
+            <w:tcW w:type="dxa" w:w="4752"/>
+          </w:tcPr>
+          <w:p>
+            <w:r/>
+            <w:r>
+              <w:rPr>
+                <w:sz w:val="18"/>
+              </w:rPr>
+              <w:t>SoC TRNG (used for the PIN salt)</w:t>
+            </w:r>
+          </w:p>
+        </w:tc>
+      </w:tr>
+      <w:tr>
+        <w:tc>
+          <w:tcPr>
+            <w:tcW w:type="dxa" w:w="3888"/>
+          </w:tcPr>
+          <w:p>
+            <w:r/>
+            <w:r>
+              <w:rPr>
+                <w:sz w:val="18"/>
+              </w:rPr>
+              <w:t>hal_get_mac / hal_get_serial</w:t>
+            </w:r>
+          </w:p>
+        </w:tc>
+        <w:tc>
+          <w:tcPr>
+            <w:tcW w:type="dxa" w:w="4752"/>
+          </w:tcPr>
+          <w:p>
+            <w:r/>
+            <w:r>
+              <w:rPr>
+                <w:sz w:val="18"/>
+              </w:rPr>
+              <w:t>Device MAC / serial for the app to identify the unit</w:t>
+            </w:r>
+          </w:p>
+        </w:tc>
+      </w:tr>
+    </w:tbl>
+    <w:p>
+      <w:pPr>
+        <w:pStyle w:val="Heading2"/>
+      </w:pPr>
+      <w:r>
+        <w:t>10.5 Feature test list (after flashing)</w:t>
+      </w:r>
+    </w:p>
+    <w:p>
+      <w:pPr>
+        <w:pStyle w:val="ListNumber"/>
+      </w:pPr>
+      <w:r>
+        <w:t>Remote A/B = Up/Down, middle = STOP; ×3 opens pairing; 10 s hold toggles BLE.</w:t>
+      </w:r>
+    </w:p>
+    <w:p>
+      <w:pPr>
+        <w:pStyle w:val="ListNumber"/>
+      </w:pPr>
+      <w:r>
+        <w:t>App: find by MAC, 123456 -&gt; set custom PIN -&gt; control; wrong PIN drops link; 5 bad tries -&gt; lockout.</w:t>
+      </w:r>
+    </w:p>
+    <w:p>
+      <w:pPr>
+        <w:pStyle w:val="ListNumber"/>
+      </w:pPr>
+      <w:r>
+        <w:t>Limit switches stop travel with the 1 s pad; obstruction (&gt;3 A/1 s) cuts + reverses.</w:t>
+      </w:r>
+    </w:p>
+    <w:p>
+      <w:pPr>
+        <w:pStyle w:val="ListNumber"/>
+      </w:pPr>
+      <w:r>
+        <w:t>Battery: &lt;19 V warn flash + DP; &lt;18 V UP-lockout; deep sleep after 10 s; wake on remote/app.</w:t>
+      </w:r>
+    </w:p>
+    <w:p>
+      <w:pPr>
+        <w:pStyle w:val="ListNumber"/>
+      </w:pPr>
+      <w:r>
+        <w:t>Reset/recovery: RST+paired fob resets PIN; RST 5 s wipes fobs; RST 10 s forces BLE on + pairing.</w:t>
+      </w:r>
+    </w:p>
+    <w:p>
+      <w:pPr>
+        <w:pStyle w:val="ListNumber"/>
+      </w:pPr>
+      <w:r>
+        <w:t>Anti-tamper: pushing a raised bollard down re-drives it up; tamper DP sent.</w:t>
+      </w:r>
+    </w:p>
+    <w:p>
+      <w:pPr>
+        <w:pStyle w:val="Heading2"/>
+      </w:pPr>
+      <w:r>
+        <w:t>10.6 Security items to finish at YET</w:t>
+      </w:r>
+    </w:p>
+    <w:p>
+      <w:pPr>
+        <w:pStyle w:val="ListBullet"/>
+      </w:pPr>
+      <w:r>
+        <w:t>Return the real secure-session state from hal_ble_link_is_encrypted() (so the PIN is only taken over an encrypted Tuya link). Keep REQUIRE_ENCRYPTED_LINK = 1 for production.</w:t>
+      </w:r>
+    </w:p>
+    <w:p>
+      <w:pPr>
+        <w:pStyle w:val="ListBullet"/>
+      </w:pPr>
+      <w:r>
+        <w:t>Enable the chip’s flash read-out / debug-port protection so the hashed PIN and keys can’t be dumped.</w:t>
+      </w:r>
+    </w:p>
+    <w:p>
+      <w:pPr>
+        <w:pStyle w:val="ListBullet"/>
+      </w:pPr>
+      <w:r>
+        <w:t>Use KeeLoq Secure learning and keep the manufacturer key secret (never in shared source).</w:t>
+      </w:r>
+    </w:p>
+    <w:p>
+      <w:pPr>
+        <w:pStyle w:val="Heading2"/>
+      </w:pPr>
+      <w:r>
+        <w:t>10.7 File map (what to copy)</w:t>
+      </w:r>
+    </w:p>
+    <w:tbl>
+      <w:tblPr>
+        <w:tblStyle w:val="LightGrid-Accent1"/>
+        <w:tblW w:type="auto" w:w="0"/>
+        <w:jc w:val="left"/>
+        <w:tblLook w:firstColumn="1" w:firstRow="1" w:lastColumn="0" w:lastRow="0" w:noHBand="0" w:noVBand="1" w:val="04A0"/>
+      </w:tblPr>
+      <w:tblGrid>
+        <w:gridCol w:w="4320"/>
+        <w:gridCol w:w="4320"/>
+      </w:tblGrid>
+      <w:tr>
+        <w:tc>
+          <w:tcPr>
+            <w:tcW w:type="dxa" w:w="2592"/>
+          </w:tcPr>
+          <w:p>
+            <w:r/>
+            <w:r>
+              <w:rPr>
+                <w:b/>
+                <w:sz w:val="18"/>
+              </w:rPr>
+              <w:t>Area</w:t>
+            </w:r>
+          </w:p>
+        </w:tc>
+        <w:tc>
+          <w:tcPr>
+            <w:tcW w:type="dxa" w:w="6048"/>
+          </w:tcPr>
+          <w:p>
+            <w:r/>
+            <w:r>
+              <w:rPr>
+                <w:b/>
+                <w:sz w:val="18"/>
+              </w:rPr>
+              <w:t>Files</w:t>
+            </w:r>
+          </w:p>
+        </w:tc>
+      </w:tr>
+      <w:tr>
+        <w:tc>
+          <w:tcPr>
+            <w:tcW w:type="dxa" w:w="2592"/>
+          </w:tcPr>
+          <w:p>
+            <w:r/>
+            <w:r>
+              <w:rPr>
+                <w:sz w:val="18"/>
+              </w:rPr>
+              <w:t>Config / HAL</w:t>
+            </w:r>
+          </w:p>
+        </w:tc>
+        <w:tc>
+          <w:tcPr>
+            <w:tcW w:type="dxa" w:w="6048"/>
+          </w:tcPr>
+          <w:p>
+            <w:r/>
+            <w:r>
+              <w:rPr>
+                <w:sz w:val="18"/>
+              </w:rPr>
+              <w:t>app_config.h, board_hal.h/.c (implement the bodies)</w:t>
+            </w:r>
+          </w:p>
+        </w:tc>
+      </w:tr>
+      <w:tr>
+        <w:tc>
+          <w:tcPr>
+            <w:tcW w:type="dxa" w:w="2592"/>
+          </w:tcPr>
+          <w:p>
+            <w:r/>
+            <w:r>
+              <w:rPr>
+                <w:sz w:val="18"/>
+              </w:rPr>
+              <w:t>Actuator + sensing</w:t>
+            </w:r>
+          </w:p>
+        </w:tc>
+        <w:tc>
+          <w:tcPr>
+            <w:tcW w:type="dxa" w:w="6048"/>
+          </w:tcPr>
+          <w:p>
+            <w:r/>
+            <w:r>
+              <w:rPr>
+                <w:sz w:val="18"/>
+              </w:rPr>
+              <w:t>bollard.h/.c, battery.h/.c, power_mgr.h/.c, led.h/.c</w:t>
+            </w:r>
+          </w:p>
+        </w:tc>
+      </w:tr>
+      <w:tr>
+        <w:tc>
+          <w:tcPr>
+            <w:tcW w:type="dxa" w:w="2592"/>
+          </w:tcPr>
+          <w:p>
+            <w:r/>
+            <w:r>
+              <w:rPr>
+                <w:sz w:val="18"/>
+              </w:rPr>
+              <w:t>Remote (RF)</w:t>
+            </w:r>
+          </w:p>
+        </w:tc>
+        <w:tc>
+          <w:tcPr>
+            <w:tcW w:type="dxa" w:w="6048"/>
+          </w:tcPr>
+          <w:p>
+            <w:r/>
+            <w:r>
+              <w:rPr>
+                <w:sz w:val="18"/>
+              </w:rPr>
+              <w:t>keeloq.h/.c, remote_store.h/.c, rf_remote.h/.c</w:t>
+            </w:r>
+          </w:p>
+        </w:tc>
+      </w:tr>
+      <w:tr>
+        <w:tc>
+          <w:tcPr>
+            <w:tcW w:type="dxa" w:w="2592"/>
+          </w:tcPr>
+          <w:p>
+            <w:r/>
+            <w:r>
+              <w:rPr>
+                <w:sz w:val="18"/>
+              </w:rPr>
+              <w:t>BLE security</w:t>
+            </w:r>
+          </w:p>
+        </w:tc>
+        <w:tc>
+          <w:tcPr>
+            <w:tcW w:type="dxa" w:w="6048"/>
+          </w:tcPr>
+          <w:p>
+            <w:r/>
+            <w:r>
+              <w:rPr>
+                <w:sz w:val="18"/>
+              </w:rPr>
+              <w:t>ble_security.h/.c, sha256.h/.c, events.h/.c</w:t>
+            </w:r>
+          </w:p>
+        </w:tc>
+      </w:tr>
+      <w:tr>
+        <w:tc>
+          <w:tcPr>
+            <w:tcW w:type="dxa" w:w="2592"/>
+          </w:tcPr>
+          <w:p>
+            <w:r/>
+            <w:r>
+              <w:rPr>
+                <w:sz w:val="18"/>
+              </w:rPr>
+              <w:t>App glue</w:t>
+            </w:r>
+          </w:p>
+        </w:tc>
+        <w:tc>
+          <w:tcPr>
+            <w:tcW w:type="dxa" w:w="6048"/>
+          </w:tcPr>
+          <w:p>
+            <w:r/>
+            <w:r>
+              <w:rPr>
+                <w:sz w:val="18"/>
+              </w:rPr>
+              <w:t>app_main.c (DP protocol + callbacks + main loop)</w:t>
+            </w:r>
+          </w:p>
+        </w:tc>
+      </w:tr>
+    </w:tbl>
     <w:sectPr>
       <w:pgSz w:w="12240" w:h="15840"/>
       <w:pgMar w:top="1440" w:right="1800" w:bottom="1440" w:left="1800" w:header="720" w:footer="720" w:gutter="0"/>

</xml_diff>